<commit_message>
subindo as minhas pastas de cv e pretendo adaptar a cada cv que eu for a submeter
</commit_message>
<xml_diff>
--- a/Meu cv/Currículo programador (1).docx
+++ b/Meu cv/Currículo programador (1).docx
@@ -64,10 +64,19 @@
       </w:pPr>
       <w:r>
         <w:rPr>
+          <w:b/>
+          <w:bCs/>
           <w:sz w:val="24"/>
           <w:szCs w:val="24"/>
         </w:rPr>
-        <w:t>Nacionalidade:</w:t>
+        <w:t>Nacionalidade</w:t>
+      </w:r>
+      <w:r>
+        <w:rPr>
+          <w:sz w:val="24"/>
+          <w:szCs w:val="24"/>
+        </w:rPr>
+        <w:t>:</w:t>
       </w:r>
       <w:r>
         <w:rPr>
@@ -98,10 +107,19 @@
       </w:pPr>
       <w:r>
         <w:rPr>
+          <w:b/>
+          <w:bCs/>
           <w:sz w:val="24"/>
           <w:szCs w:val="24"/>
         </w:rPr>
-        <w:t>Endereço: Cidade de</w:t>
+        <w:t>Endereço</w:t>
+      </w:r>
+      <w:r>
+        <w:rPr>
+          <w:sz w:val="24"/>
+          <w:szCs w:val="24"/>
+        </w:rPr>
+        <w:t>: Cidade de</w:t>
       </w:r>
       <w:r>
         <w:rPr>
@@ -131,7 +149,23 @@
           <w:sz w:val="24"/>
           <w:szCs w:val="24"/>
         </w:rPr>
-        <w:t>Trabalho Telefone: +258 85 675 2762</w:t>
+        <w:t xml:space="preserve">Trabalho </w:t>
+      </w:r>
+      <w:r>
+        <w:rPr>
+          <w:b/>
+          <w:bCs/>
+          <w:sz w:val="24"/>
+          <w:szCs w:val="24"/>
+        </w:rPr>
+        <w:t>Telefone</w:t>
+      </w:r>
+      <w:r>
+        <w:rPr>
+          <w:sz w:val="24"/>
+          <w:szCs w:val="24"/>
+        </w:rPr>
+        <w:t>: +258 85 675 2762</w:t>
       </w:r>
       <w:r>
         <w:rPr>
@@ -152,25 +186,38 @@
     <w:p>
       <w:pPr>
         <w:spacing w:line="360" w:lineRule="auto"/>
-        <w:ind w:left="118"/>
         <w:rPr>
           <w:sz w:val="24"/>
           <w:szCs w:val="24"/>
-        </w:rPr>
-      </w:pPr>
-      <w:r>
-        <w:rPr>
+          <w:lang w:val="pt-BR"/>
+        </w:rPr>
+      </w:pPr>
+      <w:r>
+        <w:rPr>
+          <w:b/>
+          <w:bCs/>
           <w:spacing w:val="-6"/>
           <w:sz w:val="24"/>
           <w:szCs w:val="24"/>
-        </w:rPr>
-        <w:t>Email:</w:t>
+          <w:lang w:val="pt-BR"/>
+        </w:rPr>
+        <w:t xml:space="preserve">  Email</w:t>
+      </w:r>
+      <w:r>
+        <w:rPr>
+          <w:spacing w:val="-6"/>
+          <w:sz w:val="24"/>
+          <w:szCs w:val="24"/>
+          <w:lang w:val="pt-BR"/>
+        </w:rPr>
+        <w:t>:</w:t>
       </w:r>
       <w:r>
         <w:rPr>
           <w:spacing w:val="-3"/>
           <w:sz w:val="24"/>
           <w:szCs w:val="24"/>
+          <w:lang w:val="pt-BR"/>
         </w:rPr>
         <w:t xml:space="preserve"> </w:t>
       </w:r>
@@ -180,6 +227,7 @@
             <w:spacing w:val="-2"/>
             <w:sz w:val="24"/>
             <w:szCs w:val="24"/>
+            <w:lang w:val="pt-BR"/>
           </w:rPr>
           <w:t>wetimaneernestovasco@gmail.com</w:t>
         </w:r>
@@ -188,25 +236,52 @@
     <w:p>
       <w:pPr>
         <w:spacing w:before="2" w:line="360" w:lineRule="auto"/>
-        <w:ind w:left="118" w:right="1039" w:firstLine="57"/>
-        <w:rPr>
+        <w:ind w:right="1039"/>
+        <w:rPr>
+          <w:spacing w:val="-8"/>
+          <w:sz w:val="24"/>
+          <w:szCs w:val="24"/>
+          <w:lang w:val="en-US"/>
+        </w:rPr>
+      </w:pPr>
+      <w:r>
+        <w:rPr>
+          <w:b/>
+          <w:bCs/>
+          <w:spacing w:val="-8"/>
           <w:sz w:val="24"/>
           <w:szCs w:val="24"/>
           <w:lang w:val="pt-BR"/>
         </w:rPr>
-      </w:pPr>
-      <w:r>
-        <w:rPr>
+        <w:t xml:space="preserve">  </w:t>
+      </w:r>
+      <w:proofErr w:type="spellStart"/>
+      <w:r>
+        <w:rPr>
+          <w:b/>
+          <w:bCs/>
           <w:spacing w:val="-8"/>
           <w:sz w:val="24"/>
           <w:szCs w:val="24"/>
-        </w:rPr>
-        <w:t>Linkedln:</w:t>
-      </w:r>
-      <w:r>
-        <w:rPr>
+          <w:lang w:val="en-US"/>
+        </w:rPr>
+        <w:t>Linkedln</w:t>
+      </w:r>
+      <w:proofErr w:type="spellEnd"/>
+      <w:r>
+        <w:rPr>
+          <w:spacing w:val="-8"/>
           <w:sz w:val="24"/>
           <w:szCs w:val="24"/>
+          <w:lang w:val="en-US"/>
+        </w:rPr>
+        <w:t>:</w:t>
+      </w:r>
+      <w:r>
+        <w:rPr>
+          <w:sz w:val="24"/>
+          <w:szCs w:val="24"/>
+          <w:lang w:val="en-US"/>
         </w:rPr>
         <w:t xml:space="preserve"> </w:t>
       </w:r>
@@ -216,78 +291,93 @@
             <w:spacing w:val="-8"/>
             <w:sz w:val="24"/>
             <w:szCs w:val="24"/>
+            <w:lang w:val="en-US"/>
           </w:rPr>
           <w:t>https://www.linkedin.com/in/ernesto-vasco-wetimane-854857360/</w:t>
         </w:r>
       </w:hyperlink>
-      <w:r>
-        <w:rPr>
-          <w:spacing w:val="-8"/>
-          <w:sz w:val="24"/>
-          <w:szCs w:val="24"/>
-        </w:rPr>
-        <w:t xml:space="preserve"> </w:t>
-      </w:r>
-      <w:r>
-        <w:rPr>
-          <w:spacing w:val="-8"/>
-          <w:sz w:val="24"/>
-          <w:szCs w:val="24"/>
-        </w:rPr>
-        <w:t xml:space="preserve"> </w:t>
-      </w:r>
-      <w:r>
-        <w:rPr>
-          <w:spacing w:val="-4"/>
-          <w:sz w:val="24"/>
-          <w:szCs w:val="24"/>
-        </w:rPr>
-        <w:t>Portfólio:</w:t>
-      </w:r>
-      <w:r>
-        <w:rPr>
-          <w:spacing w:val="-11"/>
-          <w:sz w:val="24"/>
-          <w:szCs w:val="24"/>
-        </w:rPr>
-        <w:t xml:space="preserve"> </w:t>
-      </w:r>
-      <w:r>
-        <w:rPr>
-          <w:spacing w:val="-4"/>
-          <w:sz w:val="24"/>
-          <w:szCs w:val="24"/>
-        </w:rPr>
-        <w:t>https</w:t>
-      </w:r>
-      <w:r>
-        <w:rPr>
-          <w:spacing w:val="-4"/>
-          <w:sz w:val="24"/>
-          <w:szCs w:val="24"/>
-        </w:rPr>
-        <w:t>:</w:t>
-      </w:r>
-      <w:proofErr w:type="spellStart"/>
-      <w:r>
-        <w:rPr>
-          <w:spacing w:val="-4"/>
+    </w:p>
+    <w:p>
+      <w:pPr>
+        <w:spacing w:before="2" w:line="360" w:lineRule="auto"/>
+        <w:ind w:right="1039"/>
+        <w:rPr>
           <w:sz w:val="24"/>
           <w:szCs w:val="24"/>
           <w:lang w:val="pt-BR"/>
         </w:rPr>
-        <w:t>w</w:t>
-      </w:r>
-      <w:r>
-        <w:rPr>
+      </w:pPr>
+      <w:r>
+        <w:rPr>
+          <w:b/>
+          <w:bCs/>
           <w:spacing w:val="-4"/>
           <w:sz w:val="24"/>
           <w:szCs w:val="24"/>
           <w:lang w:val="pt-BR"/>
         </w:rPr>
-        <w:t>etimane.vercel.app</w:t>
-      </w:r>
-      <w:proofErr w:type="spellEnd"/>
+        <w:t xml:space="preserve"> </w:t>
+      </w:r>
+      <w:r>
+        <w:rPr>
+          <w:b/>
+          <w:bCs/>
+          <w:spacing w:val="-4"/>
+          <w:sz w:val="24"/>
+          <w:szCs w:val="24"/>
+          <w:lang w:val="pt-BR"/>
+        </w:rPr>
+        <w:t>Portfólio</w:t>
+      </w:r>
+      <w:r>
+        <w:rPr>
+          <w:spacing w:val="-4"/>
+          <w:sz w:val="24"/>
+          <w:szCs w:val="24"/>
+          <w:lang w:val="pt-BR"/>
+        </w:rPr>
+        <w:t xml:space="preserve">: </w:t>
+      </w:r>
+      <w:hyperlink r:id="rId9" w:history="1">
+        <w:r>
+          <w:rPr>
+            <w:rStyle w:val="Hyperlink"/>
+            <w:sz w:val="24"/>
+            <w:szCs w:val="24"/>
+            <w:lang w:val="pt-BR"/>
+          </w:rPr>
+          <w:t>https://wetimane.vercel.app/</w:t>
+        </w:r>
+      </w:hyperlink>
+    </w:p>
+    <w:p>
+      <w:pPr>
+        <w:spacing w:before="2" w:line="360" w:lineRule="auto"/>
+        <w:ind w:right="1039"/>
+        <w:rPr>
+          <w:sz w:val="24"/>
+          <w:szCs w:val="24"/>
+          <w:lang w:val="pt-BR"/>
+        </w:rPr>
+      </w:pPr>
+      <w:r>
+        <w:rPr>
+          <w:b/>
+          <w:bCs/>
+          <w:sz w:val="24"/>
+          <w:szCs w:val="24"/>
+          <w:lang w:val="pt-BR"/>
+        </w:rPr>
+        <w:t xml:space="preserve"> Github: </w:t>
+      </w:r>
+      <w:r>
+        <w:rPr>
+          <w:sz w:val="24"/>
+          <w:szCs w:val="24"/>
+          <w:lang w:val="pt-BR"/>
+        </w:rPr>
+        <w:t>https://github.com/Ernestowetimane</w:t>
+      </w:r>
     </w:p>
     <w:p>
       <w:pPr>
@@ -411,7 +501,7 @@
           </mc:Choice>
           <mc:Fallback>
             <w:pict>
-              <v:shape w14:anchorId="359E0466" id="Graphic 1" o:spid="_x0000_s1026" style="position:absolute;margin-left:59.5pt;margin-top:9.7pt;width:476.2pt;height:.1pt;z-index:-15728640;visibility:visible;mso-wrap-style:square;mso-wrap-distance-left:0;mso-wrap-distance-top:0;mso-wrap-distance-right:0;mso-wrap-distance-bottom:0;mso-position-horizontal:absolute;mso-position-horizontal-relative:page;mso-position-vertical:absolute;mso-position-vertical-relative:text;v-text-anchor:top" coordsize="6047740,1270" o:gfxdata="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" path="m,l6047232,e" filled="f" strokeweight="1.44pt">
+              <v:shape w14:anchorId="2C7C65FA" id="Graphic 1" o:spid="_x0000_s1026" style="position:absolute;margin-left:59.5pt;margin-top:9.7pt;width:476.2pt;height:.1pt;z-index:-15728640;visibility:visible;mso-wrap-style:square;mso-wrap-distance-left:0;mso-wrap-distance-top:0;mso-wrap-distance-right:0;mso-wrap-distance-bottom:0;mso-position-horizontal:absolute;mso-position-horizontal-relative:page;mso-position-vertical:absolute;mso-position-vertical-relative:text;v-text-anchor:top" coordsize="6047740,1270" o:gfxdata="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" path="m,l6047232,e" filled="f" strokeweight="1.44pt">
                 <v:path arrowok="t"/>
                 <w10:wrap type="topAndBottom" anchorx="page"/>
               </v:shape>
@@ -425,12 +515,15 @@
         <w:pStyle w:val="Corpodetexto"/>
         <w:spacing w:before="195" w:line="360" w:lineRule="auto"/>
         <w:jc w:val="both"/>
-      </w:pPr>
-      <w:r>
-        <w:t>Sou desenvolvedor front-end com experiência em HTML, CSS, JavaScript e Figma. Tenho paixão por criar interfaces modernas, limpas e responsivas, transformando designs em código com precisão. Já desenvolvi vários projetos disponíveis no meu GitHub, entre eles um portfólio próprio, o site de uma agência de jornal e, mais recentemente, o site institucional de uma instituição privada aqui em Moçambique. Estou sempre em busca de aprimorar minhas habilidades e aprender novas tecnologias para entregar soluções criativas e funcionais</w:t>
-      </w:r>
-      <w:r>
-        <w:t>.</w:t>
+        <w:rPr>
+          <w:lang w:val="pt-MZ"/>
+        </w:rPr>
+      </w:pPr>
+      <w:r>
+        <w:rPr>
+          <w:lang w:val="pt-MZ"/>
+        </w:rPr>
+        <w:t>Sou desenvolvedor Full-Stack focado na criação de aplicações web modernas, responsivas e orientadas para experiência do utilizador. Tenho experiência no desenvolvimento de interfaces com HTML, CSS, JavaScript e Vue.js, e na construção de back-end com Node.js e Express.js, incluindo integração de APIs REST.</w:t>
       </w:r>
     </w:p>
     <w:p>
@@ -438,6 +531,41 @@
         <w:pStyle w:val="Corpodetexto"/>
         <w:spacing w:before="195" w:line="360" w:lineRule="auto"/>
         <w:jc w:val="both"/>
+        <w:rPr>
+          <w:lang w:val="pt-MZ"/>
+        </w:rPr>
+      </w:pPr>
+      <w:r>
+        <w:rPr>
+          <w:lang w:val="pt-MZ"/>
+        </w:rPr>
+        <w:t>Já desenvolvi projetos pessoais, académicos e institucionais, incluindo portfólio pessoal, sites institucionais e sistemas web, aplicando boas práticas de UI/UX, performance e organização de código.</w:t>
+      </w:r>
+    </w:p>
+    <w:p>
+      <w:pPr>
+        <w:pStyle w:val="Corpodetexto"/>
+        <w:spacing w:before="195" w:line="360" w:lineRule="auto"/>
+        <w:jc w:val="both"/>
+        <w:rPr>
+          <w:lang w:val="pt-MZ"/>
+        </w:rPr>
+      </w:pPr>
+      <w:r>
+        <w:rPr>
+          <w:lang w:val="pt-MZ"/>
+        </w:rPr>
+        <w:t>Tenho interesse em aprimorar minhas habilidades em frameworks modernos como React.js e Next.js, além de continuar explorando soluções de e-commerce, integração de sistemas e criação de experiências digitais funcionais e eficientes.</w:t>
+      </w:r>
+    </w:p>
+    <w:p>
+      <w:pPr>
+        <w:pStyle w:val="Corpodetexto"/>
+        <w:spacing w:before="195" w:line="360" w:lineRule="auto"/>
+        <w:jc w:val="both"/>
+        <w:rPr>
+          <w:lang w:val="pt-MZ"/>
+        </w:rPr>
       </w:pPr>
     </w:p>
     <w:p>
@@ -566,7 +694,7 @@
           </mc:Choice>
           <mc:Fallback>
             <w:pict>
-              <v:shape w14:anchorId="6D4707FE" id="Graphic 2" o:spid="_x0000_s1026" style="position:absolute;margin-left:59.5pt;margin-top:9.55pt;width:476.2pt;height:.1pt;z-index:-15728128;visibility:visible;mso-wrap-style:square;mso-wrap-distance-left:0;mso-wrap-distance-top:0;mso-wrap-distance-right:0;mso-wrap-distance-bottom:0;mso-position-horizontal:absolute;mso-position-horizontal-relative:page;mso-position-vertical:absolute;mso-position-vertical-relative:text;v-text-anchor:top" coordsize="6047740,1270" o:gfxdata="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" path="m,l6047232,e" filled="f" strokeweight="1.68pt">
+              <v:shape w14:anchorId="2F3225F4" id="Graphic 2" o:spid="_x0000_s1026" style="position:absolute;margin-left:59.5pt;margin-top:9.55pt;width:476.2pt;height:.1pt;z-index:-15728128;visibility:visible;mso-wrap-style:square;mso-wrap-distance-left:0;mso-wrap-distance-top:0;mso-wrap-distance-right:0;mso-wrap-distance-bottom:0;mso-position-horizontal:absolute;mso-position-horizontal-relative:page;mso-position-vertical:absolute;mso-position-vertical-relative:text;v-text-anchor:top" coordsize="6047740,1270" o:gfxdata="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" path="m,l6047232,e" filled="f" strokeweight="1.68pt">
                 <v:path arrowok="t"/>
                 <w10:wrap type="topAndBottom" anchorx="page"/>
               </v:shape>
@@ -849,7 +977,7 @@
           </mc:Choice>
           <mc:Fallback>
             <w:pict>
-              <v:shape w14:anchorId="6874F95F" id="Graphic 3" o:spid="_x0000_s1026" style="position:absolute;margin-left:59.5pt;margin-top:6.95pt;width:476.2pt;height:.1pt;z-index:-15727616;visibility:visible;mso-wrap-style:square;mso-wrap-distance-left:0;mso-wrap-distance-top:0;mso-wrap-distance-right:0;mso-wrap-distance-bottom:0;mso-position-horizontal:absolute;mso-position-horizontal-relative:page;mso-position-vertical:absolute;mso-position-vertical-relative:text;v-text-anchor:top" coordsize="6047740,1270" o:gfxdata="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" path="m,l6047232,e" filled="f" strokeweight="1.44pt">
+              <v:shape w14:anchorId="61932C6D" id="Graphic 3" o:spid="_x0000_s1026" style="position:absolute;margin-left:59.5pt;margin-top:6.95pt;width:476.2pt;height:.1pt;z-index:-15727616;visibility:visible;mso-wrap-style:square;mso-wrap-distance-left:0;mso-wrap-distance-top:0;mso-wrap-distance-right:0;mso-wrap-distance-bottom:0;mso-position-horizontal:absolute;mso-position-horizontal-relative:page;mso-position-vertical:absolute;mso-position-vertical-relative:text;v-text-anchor:top" coordsize="6047740,1270" o:gfxdata="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" path="m,l6047232,e" filled="f" strokeweight="1.44pt">
                 <v:path arrowok="t"/>
                 <w10:wrap type="topAndBottom" anchorx="page"/>
               </v:shape>
@@ -866,34 +994,16 @@
         <w:rPr>
           <w:b/>
           <w:bCs/>
-          <w:lang w:val="en-US"/>
-        </w:rPr>
-      </w:pPr>
-      <w:proofErr w:type="spellStart"/>
-      <w:r>
-        <w:rPr>
-          <w:b/>
-          <w:bCs/>
-          <w:lang w:val="en-US"/>
-        </w:rPr>
-        <w:t>Desenvolvedor</w:t>
-      </w:r>
-      <w:proofErr w:type="spellEnd"/>
-      <w:r>
-        <w:rPr>
-          <w:b/>
-          <w:bCs/>
-          <w:lang w:val="en-US"/>
-        </w:rPr>
-        <w:t xml:space="preserve"> Full-Stack | Freelance &amp; </w:t>
-      </w:r>
-      <w:r>
-        <w:rPr>
-          <w:b/>
-          <w:bCs/>
-          <w:lang w:val="en-US"/>
-        </w:rPr>
-        <w:t>web design</w:t>
+          <w:lang w:val="pt-BR"/>
+        </w:rPr>
+      </w:pPr>
+      <w:r>
+        <w:rPr>
+          <w:b/>
+          <w:bCs/>
+          <w:lang w:val="pt-BR"/>
+        </w:rPr>
+        <w:t>Desenvolvedor Full-Stack | Freelance &amp; web design</w:t>
       </w:r>
     </w:p>
     <w:p>
@@ -909,7 +1019,14 @@
         <w:rPr>
           <w:lang w:val="pt-MZ"/>
         </w:rPr>
-        <w:t>Desenvolvedor Full-Stack focado na criação de aplicações web modernas, escaláveis e responsivas, atuando tanto no desenvolvimento de interfaces (Front-End) quanto na construção de APIs e lógica de servidor (Back-End). Trabalho em projetos pessoais, académicos e freelance, aplicando boas práticas de desenvolvimento, arquitetura de software e experiência do utilizador (UX).</w:t>
+        <w:t xml:space="preserve">Desenvolvedor Full-Stack focado na criação de aplicações web modernas, escaláveis e responsivas, atuando tanto no desenvolvimento de interfaces (Front-End) quanto na construção de APIs e lógica de servidor (Back-End). Trabalho em projetos pessoais, académicos e freelance, </w:t>
+      </w:r>
+      <w:r>
+        <w:rPr>
+          <w:lang w:val="pt-MZ"/>
+        </w:rPr>
+        <w:lastRenderedPageBreak/>
+        <w:t>aplicando boas práticas de desenvolvimento, arquitetura de software e experiência do utilizador (UX).</w:t>
       </w:r>
     </w:p>
     <w:p>
@@ -1352,7 +1469,7 @@
           </mc:Choice>
           <mc:Fallback>
             <w:pict>
-              <v:shape w14:anchorId="1BF773DD" id="Graphic 5" o:spid="_x0000_s1026" style="position:absolute;margin-left:59.5pt;margin-top:4.45pt;width:476.2pt;height:.1pt;z-index:-15724032;visibility:visible;mso-wrap-style:square;mso-wrap-distance-left:0;mso-wrap-distance-top:0;mso-wrap-distance-right:0;mso-wrap-distance-bottom:0;mso-position-horizontal:absolute;mso-position-horizontal-relative:page;mso-position-vertical:absolute;mso-position-vertical-relative:text;v-text-anchor:top" coordsize="6047740,1270" o:gfxdata="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" path="m,l6047232,e" filled="f" strokeweight="1.68pt">
+              <v:shape w14:anchorId="52E3187C" id="Graphic 5" o:spid="_x0000_s1026" style="position:absolute;margin-left:59.5pt;margin-top:4.45pt;width:476.2pt;height:.1pt;z-index:-15724032;visibility:visible;mso-wrap-style:square;mso-wrap-distance-left:0;mso-wrap-distance-top:0;mso-wrap-distance-right:0;mso-wrap-distance-bottom:0;mso-position-horizontal:absolute;mso-position-horizontal-relative:page;mso-position-vertical:absolute;mso-position-vertical-relative:text;v-text-anchor:top" coordsize="6047740,1270" o:gfxdata="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" path="m,l6047232,e" filled="f" strokeweight="1.68pt">
                 <v:path arrowok="t"/>
                 <w10:wrap type="topAndBottom" anchorx="page"/>
               </v:shape>
@@ -1388,14 +1505,7 @@
           <w:spacing w:val="-2"/>
           <w:w w:val="115"/>
         </w:rPr>
-        <w:t>HTML5, CSS3</w:t>
-      </w:r>
-      <w:r>
-        <w:rPr>
-          <w:spacing w:val="-2"/>
-          <w:w w:val="115"/>
-        </w:rPr>
-        <w:t xml:space="preserve"> e JavaScript</w:t>
+        <w:t>HTML5, CSS3 e JavaScript</w:t>
       </w:r>
       <w:r>
         <w:rPr>
@@ -1430,14 +1540,7 @@
           <w:spacing w:val="-2"/>
           <w:w w:val="115"/>
         </w:rPr>
-        <w:t>Vue.js</w:t>
-      </w:r>
-      <w:r>
-        <w:rPr>
-          <w:spacing w:val="-2"/>
-          <w:w w:val="115"/>
-        </w:rPr>
-        <w:t xml:space="preserve"> e Nuxt.js</w:t>
+        <w:t>Vue.js e Nuxt.js</w:t>
       </w:r>
     </w:p>
     <w:p>
@@ -1454,11 +1557,7 @@
         </w:rPr>
       </w:pPr>
       <w:r>
-        <w:rPr>
-          <w:spacing w:val="-2"/>
-          <w:w w:val="115"/>
-        </w:rPr>
-        <w:t>Node.js</w:t>
+        <w:t xml:space="preserve">React.js e Next.js </w:t>
       </w:r>
     </w:p>
     <w:p>
@@ -1479,7 +1578,7 @@
           <w:spacing w:val="-2"/>
           <w:w w:val="115"/>
         </w:rPr>
-        <w:t>Express.js</w:t>
+        <w:t>Node.js</w:t>
       </w:r>
     </w:p>
     <w:p>
@@ -1500,7 +1599,7 @@
           <w:spacing w:val="-2"/>
           <w:w w:val="115"/>
         </w:rPr>
-        <w:t>REST APIs</w:t>
+        <w:t>Express.js</w:t>
       </w:r>
     </w:p>
     <w:p>
@@ -1521,7 +1620,7 @@
           <w:spacing w:val="-2"/>
           <w:w w:val="115"/>
         </w:rPr>
-        <w:t>Figma (UI/UX Design)</w:t>
+        <w:t>REST APIs</w:t>
       </w:r>
     </w:p>
     <w:p>
@@ -1542,7 +1641,7 @@
           <w:spacing w:val="-2"/>
           <w:w w:val="115"/>
         </w:rPr>
-        <w:t>Git e GitHub (controlo de versões)</w:t>
+        <w:t>Figma (UI/UX Design)</w:t>
       </w:r>
     </w:p>
     <w:p>
@@ -1563,7 +1662,7 @@
           <w:spacing w:val="-2"/>
           <w:w w:val="115"/>
         </w:rPr>
-        <w:t>Design responsivo e mobile-first</w:t>
+        <w:t>Git e GitHub (controlo de versões)</w:t>
       </w:r>
     </w:p>
     <w:p>
@@ -1577,26 +1676,14 @@
         <w:rPr>
           <w:spacing w:val="-2"/>
           <w:w w:val="115"/>
-          <w:lang w:val="en-US"/>
-        </w:rPr>
-      </w:pPr>
-      <w:proofErr w:type="spellStart"/>
-      <w:r>
-        <w:rPr>
-          <w:spacing w:val="-2"/>
-          <w:w w:val="115"/>
-          <w:lang w:val="en-US"/>
-        </w:rPr>
-        <w:t>Integração</w:t>
-      </w:r>
-      <w:proofErr w:type="spellEnd"/>
-      <w:r>
-        <w:rPr>
-          <w:spacing w:val="-2"/>
-          <w:w w:val="115"/>
-          <w:lang w:val="en-US"/>
-        </w:rPr>
-        <w:t xml:space="preserve"> front-end e back-end</w:t>
+        </w:rPr>
+      </w:pPr>
+      <w:r>
+        <w:rPr>
+          <w:spacing w:val="-2"/>
+          <w:w w:val="115"/>
+        </w:rPr>
+        <w:t>Design responsivo e mobile-first</w:t>
       </w:r>
     </w:p>
     <w:p>
@@ -1610,6 +1697,39 @@
         <w:rPr>
           <w:spacing w:val="-2"/>
           <w:w w:val="115"/>
+          <w:lang w:val="en-US"/>
+        </w:rPr>
+      </w:pPr>
+      <w:proofErr w:type="spellStart"/>
+      <w:r>
+        <w:rPr>
+          <w:spacing w:val="-2"/>
+          <w:w w:val="115"/>
+          <w:lang w:val="en-US"/>
+        </w:rPr>
+        <w:t>Integração</w:t>
+      </w:r>
+      <w:proofErr w:type="spellEnd"/>
+      <w:r>
+        <w:rPr>
+          <w:spacing w:val="-2"/>
+          <w:w w:val="115"/>
+          <w:lang w:val="en-US"/>
+        </w:rPr>
+        <w:t xml:space="preserve"> front-end e back-end</w:t>
+      </w:r>
+    </w:p>
+    <w:p>
+      <w:pPr>
+        <w:pStyle w:val="Corpodetexto"/>
+        <w:numPr>
+          <w:ilvl w:val="0"/>
+          <w:numId w:val="2"/>
+        </w:numPr>
+        <w:spacing w:before="2" w:line="360" w:lineRule="auto"/>
+        <w:rPr>
+          <w:spacing w:val="-2"/>
+          <w:w w:val="115"/>
           <w:lang w:val="pt-BR"/>
         </w:rPr>
       </w:pPr>
@@ -1636,6 +1756,30 @@
       <w:pPr>
         <w:pStyle w:val="Ttulo1"/>
         <w:ind w:left="275"/>
+      </w:pPr>
+    </w:p>
+    <w:p>
+      <w:pPr>
+        <w:pStyle w:val="Ttulo1"/>
+        <w:ind w:left="275"/>
+      </w:pPr>
+    </w:p>
+    <w:p>
+      <w:pPr>
+        <w:pStyle w:val="Ttulo1"/>
+        <w:ind w:left="275"/>
+      </w:pPr>
+    </w:p>
+    <w:p>
+      <w:pPr>
+        <w:pStyle w:val="Ttulo1"/>
+        <w:ind w:left="275"/>
+      </w:pPr>
+    </w:p>
+    <w:p>
+      <w:pPr>
+        <w:pStyle w:val="Ttulo1"/>
+        <w:ind w:left="275" w:firstLine="85"/>
       </w:pPr>
       <w:r>
         <w:t>IDIOMAS</w:t>
@@ -1721,7 +1865,7 @@
           </mc:Choice>
           <mc:Fallback>
             <w:pict>
-              <v:shape w14:anchorId="2A2B095E" id="Graphic 6" o:spid="_x0000_s1026" style="position:absolute;margin-left:59.5pt;margin-top:9.3pt;width:476.2pt;height:.1pt;z-index:-15721984;visibility:visible;mso-wrap-style:square;mso-wrap-distance-left:0;mso-wrap-distance-top:0;mso-wrap-distance-right:0;mso-wrap-distance-bottom:0;mso-position-horizontal:absolute;mso-position-horizontal-relative:page;mso-position-vertical:absolute;mso-position-vertical-relative:text;v-text-anchor:top" coordsize="6047740,1270" o:gfxdata="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" path="m,l6047232,e" filled="f" strokeweight="1.68pt">
+              <v:shape w14:anchorId="03CEAAAC" id="Graphic 6" o:spid="_x0000_s1026" style="position:absolute;margin-left:59.5pt;margin-top:9.3pt;width:476.2pt;height:.1pt;z-index:-15721984;visibility:visible;mso-wrap-style:square;mso-wrap-distance-left:0;mso-wrap-distance-top:0;mso-wrap-distance-right:0;mso-wrap-distance-bottom:0;mso-position-horizontal:absolute;mso-position-horizontal-relative:page;mso-position-vertical:absolute;mso-position-vertical-relative:text;v-text-anchor:top" coordsize="6047740,1270" o:gfxdata="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" path="m,l6047232,e" filled="f" strokeweight="1.68pt">
                 <v:path arrowok="t"/>
                 <w10:wrap type="topAndBottom" anchorx="page"/>
               </v:shape>
@@ -1960,7 +2104,7 @@
           </mc:Choice>
           <mc:Fallback>
             <w:pict>
-              <v:shape w14:anchorId="5A0B18C1" id="Graphic 6" o:spid="_x0000_s1026" style="position:absolute;margin-left:59.5pt;margin-top:9.3pt;width:476.2pt;height:.1pt;z-index:-15726080;visibility:visible;mso-wrap-style:square;mso-wrap-distance-left:0;mso-wrap-distance-top:0;mso-wrap-distance-right:0;mso-wrap-distance-bottom:0;mso-position-horizontal:absolute;mso-position-horizontal-relative:page;mso-position-vertical:absolute;mso-position-vertical-relative:text;v-text-anchor:top" coordsize="6047740,1270" o:gfxdata="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" path="m,l6047232,e" filled="f" strokeweight="1.68pt">
+              <v:shape w14:anchorId="17E47DD2" id="Graphic 6" o:spid="_x0000_s1026" style="position:absolute;margin-left:59.5pt;margin-top:9.3pt;width:476.2pt;height:.1pt;z-index:-15726080;visibility:visible;mso-wrap-style:square;mso-wrap-distance-left:0;mso-wrap-distance-top:0;mso-wrap-distance-right:0;mso-wrap-distance-bottom:0;mso-position-horizontal:absolute;mso-position-horizontal-relative:page;mso-position-vertical:absolute;mso-position-vertical-relative:text;v-text-anchor:top" coordsize="6047740,1270" o:gfxdata="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" path="m,l6047232,e" filled="f" strokeweight="1.68pt">
                 <v:path arrowok="t"/>
                 <w10:wrap type="topAndBottom" anchorx="page"/>
               </v:shape>
@@ -2032,7 +2176,6 @@
         <w:rPr>
           <w:sz w:val="26"/>
         </w:rPr>
-        <w:lastRenderedPageBreak/>
         <w:t>Boa comunicação e trabalho em equipa</w:t>
       </w:r>
     </w:p>
@@ -3202,6 +3345,7 @@
   <w:style w:type="character" w:default="1" w:styleId="Fontepargpadro">
     <w:name w:val="Default Paragraph Font"/>
     <w:uiPriority w:val="1"/>
+    <w:semiHidden/>
     <w:unhideWhenUsed/>
   </w:style>
   <w:style w:type="table" w:default="1" w:styleId="Tabelanormal">
@@ -3369,6 +3513,29 @@
     <w:rPr>
       <w:rFonts w:ascii="Calibri" w:eastAsia="Calibri" w:hAnsi="Calibri" w:cs="Calibri"/>
       <w:lang w:val="pt-PT"/>
+    </w:rPr>
+  </w:style>
+  <w:style w:type="character" w:styleId="Hyperlink">
+    <w:name w:val="Hyperlink"/>
+    <w:basedOn w:val="Fontepargpadro"/>
+    <w:uiPriority w:val="99"/>
+    <w:unhideWhenUsed/>
+    <w:rsid w:val="00232A05"/>
+    <w:rPr>
+      <w:color w:val="0000FF" w:themeColor="hyperlink"/>
+      <w:u w:val="single"/>
+    </w:rPr>
+  </w:style>
+  <w:style w:type="character" w:styleId="MenoPendente">
+    <w:name w:val="Unresolved Mention"/>
+    <w:basedOn w:val="Fontepargpadro"/>
+    <w:uiPriority w:val="99"/>
+    <w:semiHidden/>
+    <w:unhideWhenUsed/>
+    <w:rsid w:val="00232A05"/>
+    <w:rPr>
+      <w:color w:val="605E5C"/>
+      <w:shd w:val="clear" w:color="auto" w:fill="E1DFDD"/>
     </w:rPr>
   </w:style>
 </w:styles>

</xml_diff>